<commit_message>
Update to add another test and make changes to test 3
</commit_message>
<xml_diff>
--- a/tests/GoldTeam_TestPlan_AboutUs-ReservationSummary.docx
+++ b/tests/GoldTeam_TestPlan_AboutUs-ReservationSummary.docx
@@ -407,7 +407,7 @@
             </w:rPr>
             <w:fldChar w:fldCharType="separate"/>
           </w:r>
-          <w:hyperlink w:anchor="_Toc240204973" w:history="1">
+          <w:hyperlink w:anchor="_Toc240206609" w:history="1">
             <w:r>
               <w:rPr>
                 <w:rStyle w:val="Hyperlink"/>
@@ -434,7 +434,7 @@
                 <w:noProof/>
                 <w:webHidden/>
               </w:rPr>
-              <w:instrText xml:space="preserve"> PAGEREF _Toc240204973 \h </w:instrText>
+              <w:instrText xml:space="preserve"> PAGEREF _Toc240206609 \h </w:instrText>
             </w:r>
             <w:r>
               <w:rPr>
@@ -480,7 +480,7 @@
               <w14:ligatures w14:val="standardContextual"/>
             </w:rPr>
           </w:pPr>
-          <w:hyperlink w:anchor="_Toc240204974" w:history="1">
+          <w:hyperlink w:anchor="_Toc240206610" w:history="1">
             <w:r>
               <w:rPr>
                 <w:rStyle w:val="Hyperlink"/>
@@ -507,7 +507,7 @@
                 <w:noProof/>
                 <w:webHidden/>
               </w:rPr>
-              <w:instrText xml:space="preserve"> PAGEREF _Toc240204974 \h </w:instrText>
+              <w:instrText xml:space="preserve"> PAGEREF _Toc240206610 \h </w:instrText>
             </w:r>
             <w:r>
               <w:rPr>
@@ -553,13 +553,13 @@
               <w14:ligatures w14:val="standardContextual"/>
             </w:rPr>
           </w:pPr>
-          <w:hyperlink w:anchor="_Toc240204975" w:history="1">
+          <w:hyperlink w:anchor="_Toc240206611" w:history="1">
             <w:r>
               <w:rPr>
                 <w:rStyle w:val="Hyperlink"/>
                 <w:noProof/>
               </w:rPr>
-              <w:t>Reservation Summary and Confirmation</w:t>
+              <w:t>Reservation Summary Details and Calculations</w:t>
             </w:r>
             <w:r>
               <w:rPr>
@@ -580,7 +580,7 @@
                 <w:noProof/>
                 <w:webHidden/>
               </w:rPr>
-              <w:instrText xml:space="preserve"> PAGEREF _Toc240204975 \h </w:instrText>
+              <w:instrText xml:space="preserve"> PAGEREF _Toc240206611 \h </w:instrText>
             </w:r>
             <w:r>
               <w:rPr>
@@ -601,6 +601,79 @@
                 <w:webHidden/>
               </w:rPr>
               <w:t>3</w:t>
+            </w:r>
+            <w:r>
+              <w:rPr>
+                <w:noProof/>
+                <w:webHidden/>
+              </w:rPr>
+              <w:fldChar w:fldCharType="end"/>
+            </w:r>
+          </w:hyperlink>
+        </w:p>
+        <w:p>
+          <w:pPr>
+            <w:pStyle w:val="TOC1"/>
+            <w:tabs>
+              <w:tab w:val="right" w:leader="dot" w:pos="12950"/>
+            </w:tabs>
+            <w:rPr>
+              <w:rFonts w:eastAsiaTheme="minorEastAsia"/>
+              <w:noProof/>
+              <w:kern w:val="2"/>
+              <w:sz w:val="24"/>
+              <w:szCs w:val="24"/>
+              <w14:ligatures w14:val="standardContextual"/>
+            </w:rPr>
+          </w:pPr>
+          <w:hyperlink w:anchor="_Toc240206612" w:history="1">
+            <w:r>
+              <w:rPr>
+                <w:rStyle w:val="Hyperlink"/>
+                <w:noProof/>
+              </w:rPr>
+              <w:t>Reservation Editing and Confirmation</w:t>
+            </w:r>
+            <w:r>
+              <w:rPr>
+                <w:noProof/>
+                <w:webHidden/>
+              </w:rPr>
+              <w:tab/>
+            </w:r>
+            <w:r>
+              <w:rPr>
+                <w:noProof/>
+                <w:webHidden/>
+              </w:rPr>
+              <w:fldChar w:fldCharType="begin"/>
+            </w:r>
+            <w:r>
+              <w:rPr>
+                <w:noProof/>
+                <w:webHidden/>
+              </w:rPr>
+              <w:instrText xml:space="preserve"> PAGEREF _Toc240206612 \h </w:instrText>
+            </w:r>
+            <w:r>
+              <w:rPr>
+                <w:noProof/>
+                <w:webHidden/>
+              </w:rPr>
+            </w:r>
+            <w:r>
+              <w:rPr>
+                <w:noProof/>
+                <w:webHidden/>
+              </w:rPr>
+              <w:fldChar w:fldCharType="separate"/>
+            </w:r>
+            <w:r>
+              <w:rPr>
+                <w:noProof/>
+                <w:webHidden/>
+              </w:rPr>
+              <w:t>4</w:t>
             </w:r>
             <w:r>
               <w:rPr>
@@ -807,7 +880,6 @@
           <w:sz w:val="24"/>
           <w:szCs w:val="24"/>
         </w:rPr>
-        <w:lastRenderedPageBreak/>
         <w:t xml:space="preserve">For each test, the </w:t>
       </w:r>
       <w:r>
@@ -977,7 +1049,7 @@
                 <w:bCs/>
               </w:rPr>
             </w:pPr>
-            <w:bookmarkStart w:id="0" w:name="_Toc240204973"/>
+            <w:bookmarkStart w:id="0" w:name="_Toc240206609"/>
             <w:r>
               <w:t>About Us Page Content and Navigation</w:t>
             </w:r>
@@ -2150,7 +2222,6 @@
                 <w:sz w:val="24"/>
                 <w:szCs w:val="24"/>
               </w:rPr>
-              <w:lastRenderedPageBreak/>
               <w:t xml:space="preserve">Test </w:t>
             </w:r>
             <w:r>
@@ -2177,12 +2248,9 @@
                 <w:bCs/>
               </w:rPr>
             </w:pPr>
-            <w:bookmarkStart w:id="1" w:name="_Toc240204974"/>
-            <w:r>
-              <w:t>Contact Us Form Input and Validatio</w:t>
-            </w:r>
-            <w:r>
-              <w:t>n</w:t>
+            <w:bookmarkStart w:id="1" w:name="_Toc240206610"/>
+            <w:r>
+              <w:t>Contact Us Form Input and Validation</w:t>
             </w:r>
             <w:bookmarkEnd w:id="1"/>
           </w:p>
@@ -3347,12 +3415,12 @@
                 <w:bCs/>
               </w:rPr>
             </w:pPr>
-            <w:bookmarkStart w:id="2" w:name="_Toc240204975"/>
-            <w:r>
-              <w:t>Reservation Summary and Confirmatio</w:t>
-            </w:r>
-            <w:r>
-              <w:t>n</w:t>
+            <w:bookmarkStart w:id="2" w:name="_Toc240206611"/>
+            <w:r>
+              <w:t>Reservation Summary Details and Calculation</w:t>
+            </w:r>
+            <w:r>
+              <w:t>s</w:t>
             </w:r>
             <w:bookmarkEnd w:id="2"/>
           </w:p>
@@ -3417,17 +3485,7 @@
                 <w:sz w:val="20"/>
                 <w:szCs w:val="20"/>
               </w:rPr>
-              <w:t xml:space="preserve">Verify that the Reservation Summary displays </w:t>
-            </w:r>
-            <w:r>
-              <w:rPr>
-                <w:rFonts w:ascii="Arial" w:hAnsi="Arial" w:cs="Arial"/>
-                <w:color w:val="C00000"/>
-                <w:sz w:val="20"/>
-                <w:szCs w:val="20"/>
-              </w:rPr>
-              <w:lastRenderedPageBreak/>
-              <w:t>accurate reservation details, correctly calculates the total cost, and allows the user to edit or confirm the reservation.</w:t>
+              <w:t>Verify that the Reservation Summary page accurately displays the submitted room, guest, date, and special-request information and correctly calculates the number of nights and total cost.</w:t>
             </w:r>
           </w:p>
         </w:tc>
@@ -3453,7 +3511,6 @@
                 <w:sz w:val="20"/>
                 <w:szCs w:val="20"/>
               </w:rPr>
-              <w:lastRenderedPageBreak/>
               <w:t>Developer:</w:t>
             </w:r>
             <w:r>
@@ -3784,7 +3841,7 @@
                 <w:sz w:val="20"/>
                 <w:szCs w:val="20"/>
               </w:rPr>
-              <w:t>Log in, open Book Your Vacation, select a room type and valid guest count, choose a three-night date range, enter a special request, and click Book Your Reservation.</w:t>
+              <w:t>Log in, open Book Your Vacation, select a room type and valid guest count, choose a date range, enter a special request, and click Book Your Reservation.</w:t>
             </w:r>
           </w:p>
         </w:tc>
@@ -3809,7 +3866,7 @@
                 <w:sz w:val="20"/>
                 <w:szCs w:val="20"/>
               </w:rPr>
-              <w:t>The Reservation Summary page loads and displays the selected room type, nightly rate, check-in date, check-out date, number of nights, number of guests, and special request.</w:t>
+              <w:t>The Reservation Summary page loads without errors and displays the reservation information submitted by the user.</w:t>
             </w:r>
           </w:p>
         </w:tc>
@@ -3912,7 +3969,7 @@
                 <w:sz w:val="20"/>
                 <w:szCs w:val="20"/>
               </w:rPr>
-              <w:t>Compare the selected dates on the Reservation Summary page with the dates entered on the reservation form.</w:t>
+              <w:t>Compare the room type and nightly rate on the Reservation Summary page with the room selected on the reservation form.</w:t>
             </w:r>
           </w:p>
         </w:tc>
@@ -3937,7 +3994,7 @@
                 <w:sz w:val="20"/>
                 <w:szCs w:val="20"/>
               </w:rPr>
-              <w:t>The check-in and check-out dates match the submitted dates, and Number of Nights is displayed as 3.</w:t>
+              <w:t>The selected room type is correct, and the displayed nightly rate matches the lodge's rate for that room.</w:t>
             </w:r>
           </w:p>
         </w:tc>
@@ -4040,7 +4097,7 @@
                 <w:sz w:val="20"/>
                 <w:szCs w:val="20"/>
               </w:rPr>
-              <w:t>Verify the total cost shown for the three-night stay.</w:t>
+              <w:t>Compare the check-in date, check-out date, and guest count with the information entered on the reservation form.</w:t>
             </w:r>
           </w:p>
         </w:tc>
@@ -4065,7 +4122,7 @@
                 <w:sz w:val="20"/>
                 <w:szCs w:val="20"/>
               </w:rPr>
-              <w:t>The total equals the room's nightly rate multiplied by 3 and is formatted as currency with two decimal places.</w:t>
+              <w:t>The check-in date, check-out date, and number of guests exactly match the submitted reservation information.</w:t>
             </w:r>
           </w:p>
         </w:tc>
@@ -4168,7 +4225,7 @@
                 <w:sz w:val="20"/>
                 <w:szCs w:val="20"/>
               </w:rPr>
-              <w:t>Click "Edit Reservation" on the Reservation Summary page.</w:t>
+              <w:t>Review the displayed number of nights and the special request.</w:t>
             </w:r>
           </w:p>
         </w:tc>
@@ -4193,25 +4250,7 @@
                 <w:sz w:val="20"/>
                 <w:szCs w:val="20"/>
               </w:rPr>
-              <w:t>The user returns to reservation</w:t>
-            </w:r>
-            <w:r>
-              <w:rPr>
-                <w:rFonts w:ascii="Arial" w:hAnsi="Arial" w:cs="Arial"/>
-                <w:color w:val="C00000"/>
-                <w:sz w:val="20"/>
-                <w:szCs w:val="20"/>
-              </w:rPr>
-              <w:t xml:space="preserve"> page</w:t>
-            </w:r>
-            <w:r>
-              <w:rPr>
-                <w:rFonts w:ascii="Arial" w:hAnsi="Arial" w:cs="Arial"/>
-                <w:color w:val="C00000"/>
-                <w:sz w:val="20"/>
-                <w:szCs w:val="20"/>
-              </w:rPr>
-              <w:t xml:space="preserve"> and can revise the reservation before confirming it.</w:t>
+              <w:t>Number of Nights is displayed, and the special request appears as readable text without changing the page layout.</w:t>
             </w:r>
           </w:p>
         </w:tc>
@@ -4314,7 +4353,7 @@
                 <w:sz w:val="20"/>
                 <w:szCs w:val="20"/>
               </w:rPr>
-              <w:t>Create the reservation again, return to the summary, and click "Confirm Reservation."</w:t>
+              <w:t>Verify the total cost shown for the three-night stay.</w:t>
             </w:r>
           </w:p>
         </w:tc>
@@ -4339,7 +4378,7 @@
                 <w:sz w:val="20"/>
                 <w:szCs w:val="20"/>
               </w:rPr>
-              <w:t>The reservation is created once, and the user is redirected to the confirmation page with a confirmation number and the saved reservation details.</w:t>
+              <w:t>The total equals the room's nightly rate multiplied by 3 and is formatted as currency with two decimal places.</w:t>
             </w:r>
           </w:p>
         </w:tc>
@@ -4463,6 +4502,1190 @@
         </w:rPr>
       </w:pPr>
     </w:p>
+    <w:tbl>
+      <w:tblPr>
+        <w:tblStyle w:val="TableGrid"/>
+        <w:tblW w:w="0" w:type="auto"/>
+        <w:tblLook w:val="04A0" w:firstRow="1" w:lastRow="0" w:firstColumn="1" w:lastColumn="0" w:noHBand="0" w:noVBand="1"/>
+      </w:tblPr>
+      <w:tblGrid>
+        <w:gridCol w:w="1250"/>
+        <w:gridCol w:w="3570"/>
+        <w:gridCol w:w="3930"/>
+        <w:gridCol w:w="2148"/>
+        <w:gridCol w:w="2052"/>
+      </w:tblGrid>
+      <w:tr>
+        <w:trPr>
+          <w:trHeight w:val="710"/>
+        </w:trPr>
+        <w:tc>
+          <w:tcPr>
+            <w:tcW w:w="1250" w:type="dxa"/>
+          </w:tcPr>
+          <w:p>
+            <w:pPr>
+              <w:pStyle w:val="NoSpacing"/>
+              <w:spacing w:before="80" w:after="80"/>
+              <w:rPr>
+                <w:rFonts w:ascii="Arial" w:hAnsi="Arial" w:cs="Arial"/>
+                <w:sz w:val="24"/>
+                <w:szCs w:val="24"/>
+              </w:rPr>
+            </w:pPr>
+            <w:r>
+              <w:rPr>
+                <w:rFonts w:ascii="Arial" w:hAnsi="Arial" w:cs="Arial"/>
+                <w:sz w:val="24"/>
+                <w:szCs w:val="24"/>
+              </w:rPr>
+              <w:t xml:space="preserve">Test </w:t>
+            </w:r>
+            <w:r>
+              <w:rPr>
+                <w:rFonts w:ascii="Arial" w:hAnsi="Arial" w:cs="Arial"/>
+                <w:sz w:val="24"/>
+                <w:szCs w:val="24"/>
+              </w:rPr>
+              <w:t>4</w:t>
+            </w:r>
+          </w:p>
+        </w:tc>
+        <w:tc>
+          <w:tcPr>
+            <w:tcW w:w="11700" w:type="dxa"/>
+            <w:gridSpan w:val="4"/>
+          </w:tcPr>
+          <w:p>
+            <w:pPr>
+              <w:pStyle w:val="Heading1"/>
+              <w:rPr>
+                <w:rFonts w:ascii="Arial" w:hAnsi="Arial" w:cs="Arial"/>
+                <w:b/>
+                <w:bCs/>
+              </w:rPr>
+            </w:pPr>
+            <w:bookmarkStart w:id="3" w:name="_Toc240206612"/>
+            <w:r>
+              <w:t>Reservation Editing and Confirmation</w:t>
+            </w:r>
+            <w:bookmarkEnd w:id="3"/>
+          </w:p>
+        </w:tc>
+      </w:tr>
+      <w:tr>
+        <w:trPr>
+          <w:trHeight w:val="620"/>
+        </w:trPr>
+        <w:tc>
+          <w:tcPr>
+            <w:tcW w:w="1250" w:type="dxa"/>
+          </w:tcPr>
+          <w:p>
+            <w:pPr>
+              <w:pStyle w:val="NoSpacing"/>
+              <w:spacing w:before="80" w:after="80"/>
+              <w:rPr>
+                <w:rFonts w:ascii="Arial" w:hAnsi="Arial" w:cs="Arial"/>
+                <w:sz w:val="24"/>
+                <w:szCs w:val="24"/>
+              </w:rPr>
+            </w:pPr>
+          </w:p>
+        </w:tc>
+        <w:tc>
+          <w:tcPr>
+            <w:tcW w:w="3570" w:type="dxa"/>
+          </w:tcPr>
+          <w:p>
+            <w:pPr>
+              <w:rPr>
+                <w:rFonts w:ascii="Arial" w:hAnsi="Arial" w:cs="Arial"/>
+                <w:sz w:val="20"/>
+                <w:szCs w:val="20"/>
+              </w:rPr>
+            </w:pPr>
+            <w:r>
+              <w:rPr>
+                <w:rFonts w:ascii="Arial" w:hAnsi="Arial" w:cs="Arial"/>
+                <w:b/>
+                <w:bCs/>
+                <w:sz w:val="20"/>
+                <w:szCs w:val="20"/>
+              </w:rPr>
+              <w:t>Test Objective</w:t>
+            </w:r>
+            <w:r>
+              <w:rPr>
+                <w:rFonts w:ascii="Arial" w:hAnsi="Arial" w:cs="Arial"/>
+                <w:b/>
+                <w:bCs/>
+                <w:sz w:val="20"/>
+                <w:szCs w:val="20"/>
+              </w:rPr>
+              <w:t xml:space="preserve">: </w:t>
+            </w:r>
+            <w:r>
+              <w:rPr>
+                <w:rFonts w:ascii="Arial" w:hAnsi="Arial" w:cs="Arial"/>
+                <w:color w:val="C00000"/>
+                <w:sz w:val="20"/>
+                <w:szCs w:val="20"/>
+              </w:rPr>
+              <w:t xml:space="preserve">Verify that users can edit or cancel an unconfirmed reservation and successfully confirm </w:t>
+            </w:r>
+            <w:r>
+              <w:rPr>
+                <w:rFonts w:ascii="Arial" w:hAnsi="Arial" w:cs="Arial"/>
+                <w:color w:val="C00000"/>
+                <w:sz w:val="20"/>
+                <w:szCs w:val="20"/>
+              </w:rPr>
+              <w:lastRenderedPageBreak/>
+              <w:t>a valid reservation, resulting in a confirmation page with the correct reservation details and confirmation number.</w:t>
+            </w:r>
+          </w:p>
+        </w:tc>
+        <w:tc>
+          <w:tcPr>
+            <w:tcW w:w="3930" w:type="dxa"/>
+          </w:tcPr>
+          <w:p>
+            <w:pPr>
+              <w:rPr>
+                <w:rFonts w:ascii="Arial" w:hAnsi="Arial" w:cs="Arial"/>
+                <w:b/>
+                <w:bCs/>
+                <w:sz w:val="20"/>
+                <w:szCs w:val="20"/>
+              </w:rPr>
+            </w:pPr>
+            <w:r>
+              <w:rPr>
+                <w:rFonts w:ascii="Arial" w:hAnsi="Arial" w:cs="Arial"/>
+                <w:b/>
+                <w:bCs/>
+                <w:sz w:val="20"/>
+                <w:szCs w:val="20"/>
+              </w:rPr>
+              <w:lastRenderedPageBreak/>
+              <w:t>Developer:</w:t>
+            </w:r>
+            <w:r>
+              <w:rPr>
+                <w:rFonts w:ascii="Arial" w:hAnsi="Arial" w:cs="Arial"/>
+                <w:b/>
+                <w:bCs/>
+                <w:sz w:val="20"/>
+                <w:szCs w:val="20"/>
+              </w:rPr>
+              <w:t xml:space="preserve"> </w:t>
+            </w:r>
+            <w:r>
+              <w:rPr>
+                <w:sz w:val="20"/>
+                <w:szCs w:val="20"/>
+              </w:rPr>
+              <w:t xml:space="preserve">Jose </w:t>
+            </w:r>
+          </w:p>
+          <w:p>
+            <w:pPr>
+              <w:rPr>
+                <w:rFonts w:ascii="Arial" w:hAnsi="Arial" w:cs="Arial"/>
+                <w:sz w:val="20"/>
+                <w:szCs w:val="20"/>
+              </w:rPr>
+            </w:pPr>
+            <w:r>
+              <w:rPr>
+                <w:rFonts w:ascii="Arial" w:hAnsi="Arial" w:cs="Arial"/>
+                <w:b/>
+                <w:bCs/>
+                <w:sz w:val="20"/>
+                <w:szCs w:val="20"/>
+              </w:rPr>
+              <w:t>Date tested:</w:t>
+            </w:r>
+            <w:r>
+              <w:rPr>
+                <w:rFonts w:ascii="Arial" w:hAnsi="Arial" w:cs="Arial"/>
+                <w:b/>
+                <w:bCs/>
+                <w:sz w:val="20"/>
+                <w:szCs w:val="20"/>
+              </w:rPr>
+              <w:t xml:space="preserve"> </w:t>
+            </w:r>
+            <w:r>
+              <w:rPr>
+                <w:rFonts w:ascii="Arial" w:hAnsi="Arial" w:cs="Arial"/>
+                <w:sz w:val="20"/>
+                <w:szCs w:val="20"/>
+              </w:rPr>
+              <w:t>2026/09/13</w:t>
+            </w:r>
+          </w:p>
+        </w:tc>
+        <w:tc>
+          <w:tcPr>
+            <w:tcW w:w="4200" w:type="dxa"/>
+            <w:gridSpan w:val="2"/>
+          </w:tcPr>
+          <w:p>
+            <w:pPr>
+              <w:rPr>
+                <w:rFonts w:ascii="Arial" w:hAnsi="Arial" w:cs="Arial"/>
+                <w:b/>
+                <w:bCs/>
+                <w:sz w:val="20"/>
+                <w:szCs w:val="20"/>
+              </w:rPr>
+            </w:pPr>
+            <w:r>
+              <w:rPr>
+                <w:rFonts w:ascii="Arial" w:hAnsi="Arial" w:cs="Arial"/>
+                <w:b/>
+                <w:bCs/>
+                <w:sz w:val="20"/>
+                <w:szCs w:val="20"/>
+              </w:rPr>
+              <w:t xml:space="preserve">Peer tester: </w:t>
+            </w:r>
+          </w:p>
+          <w:p>
+            <w:pPr>
+              <w:rPr>
+                <w:rFonts w:ascii="Arial" w:hAnsi="Arial" w:cs="Arial"/>
+                <w:sz w:val="20"/>
+                <w:szCs w:val="20"/>
+              </w:rPr>
+            </w:pPr>
+            <w:r>
+              <w:rPr>
+                <w:rFonts w:ascii="Arial" w:hAnsi="Arial" w:cs="Arial"/>
+                <w:b/>
+                <w:bCs/>
+                <w:sz w:val="20"/>
+                <w:szCs w:val="20"/>
+              </w:rPr>
+              <w:t>Date tested:</w:t>
+            </w:r>
+            <w:r>
+              <w:rPr>
+                <w:rFonts w:ascii="Arial" w:hAnsi="Arial" w:cs="Arial"/>
+                <w:sz w:val="20"/>
+                <w:szCs w:val="20"/>
+              </w:rPr>
+              <w:t xml:space="preserve"> </w:t>
+            </w:r>
+            <w:r>
+              <w:rPr>
+                <w:rFonts w:ascii="Arial" w:hAnsi="Arial" w:cs="Arial"/>
+                <w:color w:val="C00000"/>
+                <w:sz w:val="20"/>
+                <w:szCs w:val="20"/>
+              </w:rPr>
+              <w:t>&lt;</w:t>
+            </w:r>
+            <w:proofErr w:type="spellStart"/>
+            <w:r>
+              <w:rPr>
+                <w:rFonts w:ascii="Arial" w:hAnsi="Arial" w:cs="Arial"/>
+                <w:color w:val="C00000"/>
+                <w:sz w:val="20"/>
+                <w:szCs w:val="20"/>
+              </w:rPr>
+              <w:t>yyyy</w:t>
+            </w:r>
+            <w:proofErr w:type="spellEnd"/>
+            <w:r>
+              <w:rPr>
+                <w:rFonts w:ascii="Arial" w:hAnsi="Arial" w:cs="Arial"/>
+                <w:color w:val="C00000"/>
+                <w:sz w:val="20"/>
+                <w:szCs w:val="20"/>
+              </w:rPr>
+              <w:t>/mm/dd&gt;</w:t>
+            </w:r>
+          </w:p>
+        </w:tc>
+      </w:tr>
+      <w:tr>
+        <w:trPr>
+          <w:trHeight w:val="350"/>
+        </w:trPr>
+        <w:tc>
+          <w:tcPr>
+            <w:tcW w:w="1250" w:type="dxa"/>
+          </w:tcPr>
+          <w:p>
+            <w:pPr>
+              <w:spacing w:before="80" w:after="80"/>
+              <w:rPr>
+                <w:rFonts w:ascii="Arial" w:hAnsi="Arial" w:cs="Arial"/>
+                <w:b/>
+                <w:bCs/>
+                <w:sz w:val="20"/>
+                <w:szCs w:val="20"/>
+              </w:rPr>
+            </w:pPr>
+            <w:r>
+              <w:rPr>
+                <w:rFonts w:ascii="Arial" w:hAnsi="Arial" w:cs="Arial"/>
+                <w:b/>
+                <w:bCs/>
+                <w:sz w:val="20"/>
+                <w:szCs w:val="20"/>
+              </w:rPr>
+              <w:t>Step</w:t>
+            </w:r>
+          </w:p>
+        </w:tc>
+        <w:tc>
+          <w:tcPr>
+            <w:tcW w:w="3570" w:type="dxa"/>
+          </w:tcPr>
+          <w:p>
+            <w:pPr>
+              <w:spacing w:before="80" w:after="80"/>
+              <w:rPr>
+                <w:rFonts w:ascii="Arial" w:hAnsi="Arial" w:cs="Arial"/>
+                <w:b/>
+                <w:bCs/>
+                <w:sz w:val="20"/>
+                <w:szCs w:val="20"/>
+              </w:rPr>
+            </w:pPr>
+            <w:r>
+              <w:rPr>
+                <w:rFonts w:ascii="Arial" w:hAnsi="Arial" w:cs="Arial"/>
+                <w:b/>
+                <w:bCs/>
+                <w:sz w:val="20"/>
+                <w:szCs w:val="20"/>
+              </w:rPr>
+              <w:t>Action</w:t>
+            </w:r>
+          </w:p>
+        </w:tc>
+        <w:tc>
+          <w:tcPr>
+            <w:tcW w:w="3930" w:type="dxa"/>
+          </w:tcPr>
+          <w:p>
+            <w:pPr>
+              <w:spacing w:before="80" w:after="80"/>
+              <w:rPr>
+                <w:rFonts w:ascii="Arial" w:hAnsi="Arial" w:cs="Arial"/>
+                <w:b/>
+                <w:bCs/>
+                <w:sz w:val="20"/>
+                <w:szCs w:val="20"/>
+              </w:rPr>
+            </w:pPr>
+            <w:r>
+              <w:rPr>
+                <w:rFonts w:ascii="Arial" w:hAnsi="Arial" w:cs="Arial"/>
+                <w:b/>
+                <w:bCs/>
+                <w:sz w:val="20"/>
+                <w:szCs w:val="20"/>
+              </w:rPr>
+              <w:t>Expected results:</w:t>
+            </w:r>
+          </w:p>
+        </w:tc>
+        <w:tc>
+          <w:tcPr>
+            <w:tcW w:w="2148" w:type="dxa"/>
+          </w:tcPr>
+          <w:p>
+            <w:pPr>
+              <w:spacing w:before="80" w:after="80"/>
+              <w:rPr>
+                <w:rFonts w:ascii="Arial" w:hAnsi="Arial" w:cs="Arial"/>
+                <w:b/>
+                <w:bCs/>
+                <w:sz w:val="20"/>
+                <w:szCs w:val="20"/>
+              </w:rPr>
+            </w:pPr>
+            <w:r>
+              <w:rPr>
+                <w:rFonts w:ascii="Arial" w:hAnsi="Arial" w:cs="Arial"/>
+                <w:b/>
+                <w:bCs/>
+                <w:sz w:val="20"/>
+                <w:szCs w:val="20"/>
+              </w:rPr>
+              <w:t>Developer pass/fail</w:t>
+            </w:r>
+          </w:p>
+        </w:tc>
+        <w:tc>
+          <w:tcPr>
+            <w:tcW w:w="2052" w:type="dxa"/>
+          </w:tcPr>
+          <w:p>
+            <w:pPr>
+              <w:spacing w:before="80" w:after="80"/>
+              <w:rPr>
+                <w:rFonts w:ascii="Arial" w:hAnsi="Arial" w:cs="Arial"/>
+                <w:b/>
+                <w:bCs/>
+                <w:sz w:val="20"/>
+                <w:szCs w:val="20"/>
+              </w:rPr>
+            </w:pPr>
+            <w:r>
+              <w:rPr>
+                <w:rFonts w:ascii="Arial" w:hAnsi="Arial" w:cs="Arial"/>
+                <w:b/>
+                <w:bCs/>
+                <w:sz w:val="20"/>
+                <w:szCs w:val="20"/>
+              </w:rPr>
+              <w:t>Tester pass/fail</w:t>
+            </w:r>
+          </w:p>
+        </w:tc>
+      </w:tr>
+      <w:tr>
+        <w:trPr>
+          <w:trHeight w:val="350"/>
+        </w:trPr>
+        <w:tc>
+          <w:tcPr>
+            <w:tcW w:w="1250" w:type="dxa"/>
+          </w:tcPr>
+          <w:p>
+            <w:pPr>
+              <w:spacing w:before="80" w:after="80"/>
+              <w:rPr>
+                <w:rFonts w:ascii="Arial" w:hAnsi="Arial" w:cs="Arial"/>
+                <w:sz w:val="20"/>
+                <w:szCs w:val="20"/>
+              </w:rPr>
+            </w:pPr>
+            <w:r>
+              <w:rPr>
+                <w:rFonts w:ascii="Arial" w:hAnsi="Arial" w:cs="Arial"/>
+                <w:sz w:val="20"/>
+                <w:szCs w:val="20"/>
+              </w:rPr>
+              <w:t>1</w:t>
+            </w:r>
+          </w:p>
+        </w:tc>
+        <w:tc>
+          <w:tcPr>
+            <w:tcW w:w="3570" w:type="dxa"/>
+          </w:tcPr>
+          <w:p>
+            <w:pPr>
+              <w:spacing w:before="80" w:after="80"/>
+              <w:rPr>
+                <w:rFonts w:ascii="Arial" w:hAnsi="Arial" w:cs="Arial"/>
+                <w:color w:val="C00000"/>
+                <w:sz w:val="20"/>
+                <w:szCs w:val="20"/>
+              </w:rPr>
+            </w:pPr>
+            <w:r>
+              <w:rPr>
+                <w:rFonts w:ascii="Arial" w:hAnsi="Arial" w:cs="Arial"/>
+                <w:color w:val="C00000"/>
+                <w:sz w:val="20"/>
+                <w:szCs w:val="20"/>
+              </w:rPr>
+              <w:t>From the Reservation Summary page, click "Edit Reservation."</w:t>
+            </w:r>
+          </w:p>
+        </w:tc>
+        <w:tc>
+          <w:tcPr>
+            <w:tcW w:w="3930" w:type="dxa"/>
+          </w:tcPr>
+          <w:p>
+            <w:pPr>
+              <w:spacing w:before="80" w:after="80"/>
+              <w:rPr>
+                <w:rFonts w:ascii="Arial" w:hAnsi="Arial" w:cs="Arial"/>
+                <w:color w:val="C00000"/>
+                <w:sz w:val="20"/>
+                <w:szCs w:val="20"/>
+              </w:rPr>
+            </w:pPr>
+            <w:r>
+              <w:rPr>
+                <w:rFonts w:ascii="Arial" w:hAnsi="Arial" w:cs="Arial"/>
+                <w:color w:val="C00000"/>
+                <w:sz w:val="20"/>
+                <w:szCs w:val="20"/>
+              </w:rPr>
+              <w:t>The user returns to reservation</w:t>
+            </w:r>
+            <w:r>
+              <w:rPr>
+                <w:rFonts w:ascii="Arial" w:hAnsi="Arial" w:cs="Arial"/>
+                <w:color w:val="C00000"/>
+                <w:sz w:val="20"/>
+                <w:szCs w:val="20"/>
+              </w:rPr>
+              <w:t xml:space="preserve"> page</w:t>
+            </w:r>
+            <w:r>
+              <w:rPr>
+                <w:rFonts w:ascii="Arial" w:hAnsi="Arial" w:cs="Arial"/>
+                <w:color w:val="C00000"/>
+                <w:sz w:val="20"/>
+                <w:szCs w:val="20"/>
+              </w:rPr>
+              <w:t xml:space="preserve"> without creating a reservation and can enter revised information.</w:t>
+            </w:r>
+          </w:p>
+        </w:tc>
+        <w:tc>
+          <w:tcPr>
+            <w:tcW w:w="2148" w:type="dxa"/>
+          </w:tcPr>
+          <w:p>
+            <w:pPr>
+              <w:spacing w:before="80" w:after="80"/>
+              <w:rPr>
+                <w:rFonts w:ascii="Arial" w:hAnsi="Arial" w:cs="Arial"/>
+                <w:color w:val="C00000"/>
+                <w:sz w:val="20"/>
+                <w:szCs w:val="20"/>
+              </w:rPr>
+            </w:pPr>
+            <w:r>
+              <w:rPr>
+                <w:rFonts w:ascii="Arial" w:hAnsi="Arial" w:cs="Arial"/>
+                <w:color w:val="7030A0"/>
+                <w:sz w:val="20"/>
+                <w:szCs w:val="20"/>
+              </w:rPr>
+              <w:t>yes</w:t>
+            </w:r>
+          </w:p>
+        </w:tc>
+        <w:tc>
+          <w:tcPr>
+            <w:tcW w:w="2052" w:type="dxa"/>
+          </w:tcPr>
+          <w:p>
+            <w:pPr>
+              <w:spacing w:before="80" w:after="80"/>
+              <w:rPr>
+                <w:rFonts w:ascii="Arial" w:hAnsi="Arial" w:cs="Arial"/>
+                <w:color w:val="C00000"/>
+                <w:sz w:val="20"/>
+                <w:szCs w:val="20"/>
+              </w:rPr>
+            </w:pPr>
+            <w:r>
+              <w:rPr>
+                <w:rFonts w:ascii="Arial" w:hAnsi="Arial" w:cs="Arial"/>
+                <w:color w:val="C00000"/>
+                <w:sz w:val="20"/>
+                <w:szCs w:val="20"/>
+              </w:rPr>
+              <w:t>&lt;yes/no&gt;</w:t>
+            </w:r>
+          </w:p>
+        </w:tc>
+      </w:tr>
+      <w:tr>
+        <w:trPr>
+          <w:trHeight w:val="350"/>
+        </w:trPr>
+        <w:tc>
+          <w:tcPr>
+            <w:tcW w:w="1250" w:type="dxa"/>
+          </w:tcPr>
+          <w:p>
+            <w:pPr>
+              <w:spacing w:before="80" w:after="80"/>
+              <w:rPr>
+                <w:rFonts w:ascii="Arial" w:hAnsi="Arial" w:cs="Arial"/>
+                <w:sz w:val="20"/>
+                <w:szCs w:val="20"/>
+              </w:rPr>
+            </w:pPr>
+            <w:r>
+              <w:rPr>
+                <w:rFonts w:ascii="Arial" w:hAnsi="Arial" w:cs="Arial"/>
+                <w:sz w:val="20"/>
+                <w:szCs w:val="20"/>
+              </w:rPr>
+              <w:t>2</w:t>
+            </w:r>
+          </w:p>
+        </w:tc>
+        <w:tc>
+          <w:tcPr>
+            <w:tcW w:w="3570" w:type="dxa"/>
+          </w:tcPr>
+          <w:p>
+            <w:pPr>
+              <w:spacing w:before="80" w:after="80"/>
+              <w:rPr>
+                <w:rFonts w:ascii="Arial" w:hAnsi="Arial" w:cs="Arial"/>
+                <w:color w:val="C00000"/>
+                <w:sz w:val="20"/>
+                <w:szCs w:val="20"/>
+              </w:rPr>
+            </w:pPr>
+            <w:r>
+              <w:rPr>
+                <w:rFonts w:ascii="Arial" w:hAnsi="Arial" w:cs="Arial"/>
+                <w:color w:val="C00000"/>
+                <w:sz w:val="20"/>
+                <w:szCs w:val="20"/>
+              </w:rPr>
+              <w:t>Change the room type, guest count, or dates; then click Book Your Reservation again.</w:t>
+            </w:r>
+          </w:p>
+        </w:tc>
+        <w:tc>
+          <w:tcPr>
+            <w:tcW w:w="3930" w:type="dxa"/>
+          </w:tcPr>
+          <w:p>
+            <w:pPr>
+              <w:spacing w:before="80" w:after="80"/>
+              <w:rPr>
+                <w:rFonts w:ascii="Arial" w:hAnsi="Arial" w:cs="Arial"/>
+                <w:color w:val="C00000"/>
+                <w:sz w:val="20"/>
+                <w:szCs w:val="20"/>
+              </w:rPr>
+            </w:pPr>
+            <w:r>
+              <w:rPr>
+                <w:rFonts w:ascii="Arial" w:hAnsi="Arial" w:cs="Arial"/>
+                <w:color w:val="C00000"/>
+                <w:sz w:val="20"/>
+                <w:szCs w:val="20"/>
+              </w:rPr>
+              <w:t>The Reservation Summary page displays the revised values and recalculates the number of nights and total cost correctly.</w:t>
+            </w:r>
+          </w:p>
+        </w:tc>
+        <w:tc>
+          <w:tcPr>
+            <w:tcW w:w="2148" w:type="dxa"/>
+          </w:tcPr>
+          <w:p>
+            <w:pPr>
+              <w:spacing w:before="80" w:after="80"/>
+              <w:rPr>
+                <w:rFonts w:ascii="Arial" w:hAnsi="Arial" w:cs="Arial"/>
+                <w:color w:val="C00000"/>
+                <w:sz w:val="20"/>
+                <w:szCs w:val="20"/>
+              </w:rPr>
+            </w:pPr>
+            <w:r>
+              <w:rPr>
+                <w:rFonts w:ascii="Arial" w:hAnsi="Arial" w:cs="Arial"/>
+                <w:color w:val="7030A0"/>
+                <w:sz w:val="20"/>
+                <w:szCs w:val="20"/>
+              </w:rPr>
+              <w:t>yes</w:t>
+            </w:r>
+          </w:p>
+        </w:tc>
+        <w:tc>
+          <w:tcPr>
+            <w:tcW w:w="2052" w:type="dxa"/>
+          </w:tcPr>
+          <w:p>
+            <w:pPr>
+              <w:spacing w:before="80" w:after="80"/>
+              <w:rPr>
+                <w:rFonts w:ascii="Arial" w:hAnsi="Arial" w:cs="Arial"/>
+                <w:color w:val="C00000"/>
+                <w:sz w:val="20"/>
+                <w:szCs w:val="20"/>
+              </w:rPr>
+            </w:pPr>
+            <w:r>
+              <w:rPr>
+                <w:rFonts w:ascii="Arial" w:hAnsi="Arial" w:cs="Arial"/>
+                <w:color w:val="C00000"/>
+                <w:sz w:val="20"/>
+                <w:szCs w:val="20"/>
+              </w:rPr>
+              <w:t>&lt;yes/no&gt;</w:t>
+            </w:r>
+          </w:p>
+        </w:tc>
+      </w:tr>
+      <w:tr>
+        <w:trPr>
+          <w:trHeight w:val="350"/>
+        </w:trPr>
+        <w:tc>
+          <w:tcPr>
+            <w:tcW w:w="1250" w:type="dxa"/>
+          </w:tcPr>
+          <w:p>
+            <w:pPr>
+              <w:spacing w:before="80" w:after="80"/>
+              <w:rPr>
+                <w:rFonts w:ascii="Arial" w:hAnsi="Arial" w:cs="Arial"/>
+                <w:sz w:val="20"/>
+                <w:szCs w:val="20"/>
+              </w:rPr>
+            </w:pPr>
+            <w:r>
+              <w:rPr>
+                <w:rFonts w:ascii="Arial" w:hAnsi="Arial" w:cs="Arial"/>
+                <w:sz w:val="20"/>
+                <w:szCs w:val="20"/>
+              </w:rPr>
+              <w:t>3</w:t>
+            </w:r>
+          </w:p>
+        </w:tc>
+        <w:tc>
+          <w:tcPr>
+            <w:tcW w:w="3570" w:type="dxa"/>
+          </w:tcPr>
+          <w:p>
+            <w:pPr>
+              <w:spacing w:before="80" w:after="80"/>
+              <w:rPr>
+                <w:rFonts w:ascii="Arial" w:hAnsi="Arial" w:cs="Arial"/>
+                <w:color w:val="C00000"/>
+                <w:sz w:val="20"/>
+                <w:szCs w:val="20"/>
+              </w:rPr>
+            </w:pPr>
+            <w:r>
+              <w:rPr>
+                <w:rFonts w:ascii="Arial" w:hAnsi="Arial" w:cs="Arial"/>
+                <w:color w:val="C00000"/>
+                <w:sz w:val="20"/>
+                <w:szCs w:val="20"/>
+              </w:rPr>
+              <w:t>Click "Cancel" on the Reservation Summary page.</w:t>
+            </w:r>
+          </w:p>
+        </w:tc>
+        <w:tc>
+          <w:tcPr>
+            <w:tcW w:w="3930" w:type="dxa"/>
+          </w:tcPr>
+          <w:p>
+            <w:pPr>
+              <w:spacing w:before="80" w:after="80"/>
+              <w:rPr>
+                <w:rFonts w:ascii="Arial" w:hAnsi="Arial" w:cs="Arial"/>
+                <w:color w:val="C00000"/>
+                <w:sz w:val="20"/>
+                <w:szCs w:val="20"/>
+              </w:rPr>
+            </w:pPr>
+            <w:r>
+              <w:rPr>
+                <w:rFonts w:ascii="Arial" w:hAnsi="Arial" w:cs="Arial"/>
+                <w:color w:val="C00000"/>
+                <w:sz w:val="20"/>
+                <w:szCs w:val="20"/>
+              </w:rPr>
+              <w:t xml:space="preserve">The user returns to </w:t>
+            </w:r>
+            <w:r>
+              <w:rPr>
+                <w:rFonts w:ascii="Arial" w:hAnsi="Arial" w:cs="Arial"/>
+                <w:color w:val="C00000"/>
+                <w:sz w:val="20"/>
+                <w:szCs w:val="20"/>
+              </w:rPr>
+              <w:t>home</w:t>
+            </w:r>
+            <w:r>
+              <w:rPr>
+                <w:rFonts w:ascii="Arial" w:hAnsi="Arial" w:cs="Arial"/>
+                <w:color w:val="C00000"/>
+                <w:sz w:val="20"/>
+                <w:szCs w:val="20"/>
+              </w:rPr>
+              <w:t>, and the unconfirmed reservation is not created.</w:t>
+            </w:r>
+          </w:p>
+        </w:tc>
+        <w:tc>
+          <w:tcPr>
+            <w:tcW w:w="2148" w:type="dxa"/>
+          </w:tcPr>
+          <w:p>
+            <w:pPr>
+              <w:spacing w:before="80" w:after="80"/>
+              <w:rPr>
+                <w:rFonts w:ascii="Arial" w:hAnsi="Arial" w:cs="Arial"/>
+                <w:color w:val="C00000"/>
+                <w:sz w:val="20"/>
+                <w:szCs w:val="20"/>
+              </w:rPr>
+            </w:pPr>
+            <w:r>
+              <w:rPr>
+                <w:rFonts w:ascii="Arial" w:hAnsi="Arial" w:cs="Arial"/>
+                <w:color w:val="7030A0"/>
+                <w:sz w:val="20"/>
+                <w:szCs w:val="20"/>
+              </w:rPr>
+              <w:t>yes</w:t>
+            </w:r>
+          </w:p>
+        </w:tc>
+        <w:tc>
+          <w:tcPr>
+            <w:tcW w:w="2052" w:type="dxa"/>
+          </w:tcPr>
+          <w:p>
+            <w:pPr>
+              <w:spacing w:before="80" w:after="80"/>
+              <w:rPr>
+                <w:rFonts w:ascii="Arial" w:hAnsi="Arial" w:cs="Arial"/>
+                <w:color w:val="C00000"/>
+                <w:sz w:val="20"/>
+                <w:szCs w:val="20"/>
+              </w:rPr>
+            </w:pPr>
+            <w:r>
+              <w:rPr>
+                <w:rFonts w:ascii="Arial" w:hAnsi="Arial" w:cs="Arial"/>
+                <w:color w:val="C00000"/>
+                <w:sz w:val="20"/>
+                <w:szCs w:val="20"/>
+              </w:rPr>
+              <w:t>&lt;yes/no&gt;</w:t>
+            </w:r>
+          </w:p>
+        </w:tc>
+      </w:tr>
+      <w:tr>
+        <w:trPr>
+          <w:trHeight w:val="350"/>
+        </w:trPr>
+        <w:tc>
+          <w:tcPr>
+            <w:tcW w:w="1250" w:type="dxa"/>
+          </w:tcPr>
+          <w:p>
+            <w:pPr>
+              <w:spacing w:before="80" w:after="80"/>
+              <w:rPr>
+                <w:rFonts w:ascii="Arial" w:hAnsi="Arial" w:cs="Arial"/>
+                <w:sz w:val="20"/>
+                <w:szCs w:val="20"/>
+              </w:rPr>
+            </w:pPr>
+            <w:r>
+              <w:rPr>
+                <w:rFonts w:ascii="Arial" w:hAnsi="Arial" w:cs="Arial"/>
+                <w:sz w:val="20"/>
+                <w:szCs w:val="20"/>
+              </w:rPr>
+              <w:t>4</w:t>
+            </w:r>
+          </w:p>
+        </w:tc>
+        <w:tc>
+          <w:tcPr>
+            <w:tcW w:w="3570" w:type="dxa"/>
+          </w:tcPr>
+          <w:p>
+            <w:pPr>
+              <w:spacing w:before="80" w:after="80"/>
+              <w:rPr>
+                <w:rFonts w:ascii="Arial" w:hAnsi="Arial" w:cs="Arial"/>
+                <w:color w:val="C00000"/>
+                <w:sz w:val="20"/>
+                <w:szCs w:val="20"/>
+              </w:rPr>
+            </w:pPr>
+            <w:r>
+              <w:rPr>
+                <w:rFonts w:ascii="Arial" w:hAnsi="Arial" w:cs="Arial"/>
+                <w:color w:val="C00000"/>
+                <w:sz w:val="20"/>
+                <w:szCs w:val="20"/>
+              </w:rPr>
+              <w:t>Create another valid reservation, review the summary, and click "Confirm Reservation."</w:t>
+            </w:r>
+          </w:p>
+        </w:tc>
+        <w:tc>
+          <w:tcPr>
+            <w:tcW w:w="3930" w:type="dxa"/>
+          </w:tcPr>
+          <w:p>
+            <w:pPr>
+              <w:spacing w:before="80" w:after="80"/>
+              <w:rPr>
+                <w:rFonts w:ascii="Arial" w:hAnsi="Arial" w:cs="Arial"/>
+                <w:color w:val="C00000"/>
+                <w:sz w:val="20"/>
+                <w:szCs w:val="20"/>
+              </w:rPr>
+            </w:pPr>
+            <w:r>
+              <w:rPr>
+                <w:rFonts w:ascii="Arial" w:hAnsi="Arial" w:cs="Arial"/>
+                <w:color w:val="C00000"/>
+                <w:sz w:val="20"/>
+                <w:szCs w:val="20"/>
+              </w:rPr>
+              <w:t>The reservation is created once, and the user is redirected to the reservation confirmation page.</w:t>
+            </w:r>
+          </w:p>
+        </w:tc>
+        <w:tc>
+          <w:tcPr>
+            <w:tcW w:w="2148" w:type="dxa"/>
+          </w:tcPr>
+          <w:p>
+            <w:pPr>
+              <w:spacing w:before="80" w:after="80"/>
+              <w:rPr>
+                <w:rFonts w:ascii="Arial" w:hAnsi="Arial" w:cs="Arial"/>
+                <w:color w:val="C00000"/>
+                <w:sz w:val="20"/>
+                <w:szCs w:val="20"/>
+              </w:rPr>
+            </w:pPr>
+            <w:r>
+              <w:rPr>
+                <w:rFonts w:ascii="Arial" w:hAnsi="Arial" w:cs="Arial"/>
+                <w:color w:val="7030A0"/>
+                <w:sz w:val="20"/>
+                <w:szCs w:val="20"/>
+              </w:rPr>
+              <w:t>yes</w:t>
+            </w:r>
+          </w:p>
+        </w:tc>
+        <w:tc>
+          <w:tcPr>
+            <w:tcW w:w="2052" w:type="dxa"/>
+          </w:tcPr>
+          <w:p>
+            <w:pPr>
+              <w:spacing w:before="80" w:after="80"/>
+              <w:rPr>
+                <w:rFonts w:ascii="Arial" w:hAnsi="Arial" w:cs="Arial"/>
+                <w:color w:val="C00000"/>
+                <w:sz w:val="20"/>
+                <w:szCs w:val="20"/>
+              </w:rPr>
+            </w:pPr>
+            <w:r>
+              <w:rPr>
+                <w:rFonts w:ascii="Arial" w:hAnsi="Arial" w:cs="Arial"/>
+                <w:color w:val="C00000"/>
+                <w:sz w:val="20"/>
+                <w:szCs w:val="20"/>
+              </w:rPr>
+              <w:t>&lt;yes/no&gt;</w:t>
+            </w:r>
+          </w:p>
+        </w:tc>
+      </w:tr>
+      <w:tr>
+        <w:trPr>
+          <w:trHeight w:val="350"/>
+        </w:trPr>
+        <w:tc>
+          <w:tcPr>
+            <w:tcW w:w="1250" w:type="dxa"/>
+          </w:tcPr>
+          <w:p>
+            <w:pPr>
+              <w:spacing w:before="80" w:after="80"/>
+              <w:rPr>
+                <w:rFonts w:ascii="Arial" w:hAnsi="Arial" w:cs="Arial"/>
+                <w:sz w:val="20"/>
+                <w:szCs w:val="20"/>
+              </w:rPr>
+            </w:pPr>
+            <w:r>
+              <w:rPr>
+                <w:rFonts w:ascii="Arial" w:hAnsi="Arial" w:cs="Arial"/>
+                <w:sz w:val="20"/>
+                <w:szCs w:val="20"/>
+              </w:rPr>
+              <w:t>5</w:t>
+            </w:r>
+          </w:p>
+        </w:tc>
+        <w:tc>
+          <w:tcPr>
+            <w:tcW w:w="3570" w:type="dxa"/>
+          </w:tcPr>
+          <w:p>
+            <w:pPr>
+              <w:spacing w:before="80" w:after="80"/>
+              <w:rPr>
+                <w:rFonts w:ascii="Arial" w:hAnsi="Arial" w:cs="Arial"/>
+                <w:color w:val="C00000"/>
+                <w:sz w:val="20"/>
+                <w:szCs w:val="20"/>
+              </w:rPr>
+            </w:pPr>
+            <w:r>
+              <w:rPr>
+                <w:rFonts w:ascii="Arial" w:hAnsi="Arial" w:cs="Arial"/>
+                <w:color w:val="C00000"/>
+                <w:sz w:val="20"/>
+                <w:szCs w:val="20"/>
+              </w:rPr>
+              <w:t>Review the reservation confirmation page and its confirmation number.</w:t>
+            </w:r>
+          </w:p>
+        </w:tc>
+        <w:tc>
+          <w:tcPr>
+            <w:tcW w:w="3930" w:type="dxa"/>
+          </w:tcPr>
+          <w:p>
+            <w:pPr>
+              <w:spacing w:before="80" w:after="80"/>
+              <w:rPr>
+                <w:rFonts w:ascii="Arial" w:hAnsi="Arial" w:cs="Arial"/>
+                <w:color w:val="C00000"/>
+                <w:sz w:val="20"/>
+                <w:szCs w:val="20"/>
+              </w:rPr>
+            </w:pPr>
+            <w:r>
+              <w:rPr>
+                <w:rFonts w:ascii="Arial" w:hAnsi="Arial" w:cs="Arial"/>
+                <w:color w:val="C00000"/>
+                <w:sz w:val="20"/>
+                <w:szCs w:val="20"/>
+              </w:rPr>
+              <w:t>A confirmation number beginning with MBR- and the saved reservation details are displayed without errors.</w:t>
+            </w:r>
+          </w:p>
+        </w:tc>
+        <w:tc>
+          <w:tcPr>
+            <w:tcW w:w="2148" w:type="dxa"/>
+          </w:tcPr>
+          <w:p>
+            <w:pPr>
+              <w:spacing w:before="80" w:after="80"/>
+              <w:rPr>
+                <w:rFonts w:ascii="Arial" w:hAnsi="Arial" w:cs="Arial"/>
+                <w:color w:val="C00000"/>
+                <w:sz w:val="20"/>
+                <w:szCs w:val="20"/>
+              </w:rPr>
+            </w:pPr>
+            <w:r>
+              <w:rPr>
+                <w:rFonts w:ascii="Arial" w:hAnsi="Arial" w:cs="Arial"/>
+                <w:color w:val="7030A0"/>
+                <w:sz w:val="20"/>
+                <w:szCs w:val="20"/>
+              </w:rPr>
+              <w:t>yes</w:t>
+            </w:r>
+          </w:p>
+        </w:tc>
+        <w:tc>
+          <w:tcPr>
+            <w:tcW w:w="2052" w:type="dxa"/>
+          </w:tcPr>
+          <w:p>
+            <w:pPr>
+              <w:spacing w:before="80" w:after="80"/>
+              <w:rPr>
+                <w:rFonts w:ascii="Arial" w:hAnsi="Arial" w:cs="Arial"/>
+                <w:color w:val="C00000"/>
+                <w:sz w:val="20"/>
+                <w:szCs w:val="20"/>
+              </w:rPr>
+            </w:pPr>
+            <w:r>
+              <w:rPr>
+                <w:rFonts w:ascii="Arial" w:hAnsi="Arial" w:cs="Arial"/>
+                <w:color w:val="C00000"/>
+                <w:sz w:val="20"/>
+                <w:szCs w:val="20"/>
+              </w:rPr>
+              <w:t>&lt;yes/no&gt;</w:t>
+            </w:r>
+          </w:p>
+        </w:tc>
+      </w:tr>
+      <w:tr>
+        <w:trPr>
+          <w:trHeight w:val="350"/>
+        </w:trPr>
+        <w:tc>
+          <w:tcPr>
+            <w:tcW w:w="1250" w:type="dxa"/>
+          </w:tcPr>
+          <w:p>
+            <w:pPr>
+              <w:spacing w:before="80" w:after="80"/>
+              <w:rPr>
+                <w:rFonts w:ascii="Arial" w:hAnsi="Arial" w:cs="Arial"/>
+                <w:b/>
+                <w:bCs/>
+                <w:sz w:val="20"/>
+                <w:szCs w:val="20"/>
+              </w:rPr>
+            </w:pPr>
+            <w:r>
+              <w:rPr>
+                <w:rFonts w:ascii="Arial" w:hAnsi="Arial" w:cs="Arial"/>
+                <w:b/>
+                <w:bCs/>
+                <w:sz w:val="20"/>
+                <w:szCs w:val="20"/>
+              </w:rPr>
+              <w:t>Comments</w:t>
+            </w:r>
+          </w:p>
+        </w:tc>
+        <w:tc>
+          <w:tcPr>
+            <w:tcW w:w="11700" w:type="dxa"/>
+            <w:gridSpan w:val="4"/>
+          </w:tcPr>
+          <w:p>
+            <w:pPr>
+              <w:spacing w:before="80" w:after="80"/>
+              <w:rPr>
+                <w:rFonts w:ascii="Arial" w:hAnsi="Arial" w:cs="Arial"/>
+                <w:color w:val="C00000"/>
+                <w:sz w:val="20"/>
+                <w:szCs w:val="20"/>
+              </w:rPr>
+            </w:pPr>
+            <w:r>
+              <w:rPr>
+                <w:rFonts w:ascii="Arial" w:hAnsi="Arial" w:cs="Arial"/>
+                <w:color w:val="C00000"/>
+                <w:sz w:val="20"/>
+                <w:szCs w:val="20"/>
+              </w:rPr>
+              <w:t>Comments should be substantive; this means there should be at least 2-3 well-structured sentences with constructive feedback.</w:t>
+            </w:r>
+          </w:p>
+        </w:tc>
+      </w:tr>
+    </w:tbl>
     <w:p>
       <w:pPr>
         <w:pStyle w:val="NoSpacing"/>

</xml_diff>